<commit_message>
Spia Green Background Update
</commit_message>
<xml_diff>
--- a/Reference (Spia)/HERO BANNER+ABOUT.docx
+++ b/Reference (Spia)/HERO BANNER+ABOUT.docx
@@ -13,7 +13,14 @@
           <w:b/>
           <w:bCs/>
         </w:rPr>
-        <w:t>Curating Curiosity.</w:t>
+        <w:t>Beneath the Noise</w:t>
+      </w:r>
+      <w:r>
+        <w:rPr>
+          <w:b/>
+          <w:bCs/>
+        </w:rPr>
+        <w:t>.</w:t>
       </w:r>
       <w:r>
         <w:br/>
@@ -217,6 +224,148 @@
       </w:r>
     </w:p>
     <w:p/>
+    <w:p/>
+    <w:p>
+      <w:proofErr w:type="gramStart"/>
+      <w:r>
+        <w:t xml:space="preserve">  </w:t>
+      </w:r>
+      <w:r>
+        <w:rPr>
+          <w:b/>
+          <w:bCs/>
+        </w:rPr>
+        <w:t>Beneath</w:t>
+      </w:r>
+      <w:proofErr w:type="gramEnd"/>
+      <w:r>
+        <w:rPr>
+          <w:b/>
+          <w:bCs/>
+        </w:rPr>
+        <w:t xml:space="preserve"> the noise</w:t>
+      </w:r>
+      <w:r>
+        <w:br/>
+      </w:r>
+      <w:r>
+        <w:rPr>
+          <w:i/>
+          <w:iCs/>
+        </w:rPr>
+        <w:t>Find what matters.</w:t>
+      </w:r>
+      <w:r>
+        <w:t xml:space="preserve"> </w:t>
+      </w:r>
+    </w:p>
+    <w:p>
+      <w:proofErr w:type="gramStart"/>
+      <w:r>
+        <w:t xml:space="preserve">  </w:t>
+      </w:r>
+      <w:r>
+        <w:rPr>
+          <w:b/>
+          <w:bCs/>
+        </w:rPr>
+        <w:t>Cut</w:t>
+      </w:r>
+      <w:proofErr w:type="gramEnd"/>
+      <w:r>
+        <w:rPr>
+          <w:b/>
+          <w:bCs/>
+        </w:rPr>
+        <w:t xml:space="preserve"> the noise</w:t>
+      </w:r>
+      <w:r>
+        <w:br/>
+      </w:r>
+      <w:r>
+        <w:rPr>
+          <w:i/>
+          <w:iCs/>
+        </w:rPr>
+        <w:t>Follow what matters.</w:t>
+      </w:r>
+      <w:r>
+        <w:t xml:space="preserve"> </w:t>
+      </w:r>
+    </w:p>
+    <w:p>
+      <w:pPr>
+        <w:rPr>
+          <w:i/>
+          <w:iCs/>
+        </w:rPr>
+      </w:pPr>
+      <w:proofErr w:type="gramStart"/>
+      <w:r>
+        <w:t xml:space="preserve">  </w:t>
+      </w:r>
+      <w:r>
+        <w:rPr>
+          <w:b/>
+          <w:bCs/>
+        </w:rPr>
+        <w:t>Beneath</w:t>
+      </w:r>
+      <w:proofErr w:type="gramEnd"/>
+      <w:r>
+        <w:rPr>
+          <w:b/>
+          <w:bCs/>
+        </w:rPr>
+        <w:t xml:space="preserve"> the noise</w:t>
+      </w:r>
+      <w:r>
+        <w:br/>
+      </w:r>
+      <w:r>
+        <w:rPr>
+          <w:i/>
+          <w:iCs/>
+        </w:rPr>
+        <w:t>Only the stories that stay.</w:t>
+      </w:r>
+    </w:p>
+    <w:p>
+      <w:pPr>
+        <w:rPr>
+          <w:i/>
+          <w:iCs/>
+        </w:rPr>
+      </w:pPr>
+    </w:p>
+    <w:p>
+      <w:r>
+        <w:rPr>
+          <w:rFonts w:ascii="Segoe UI Emoji" w:hAnsi="Segoe UI Emoji" w:cs="Segoe UI Emoji"/>
+        </w:rPr>
+        <w:t>👉</w:t>
+      </w:r>
+      <w:r>
+        <w:t xml:space="preserve"> </w:t>
+      </w:r>
+      <w:r>
+        <w:rPr>
+          <w:b/>
+          <w:bCs/>
+        </w:rPr>
+        <w:t>Beneath the noise</w:t>
+      </w:r>
+      <w:r>
+        <w:br/>
+      </w:r>
+      <w:r>
+        <w:rPr>
+          <w:i/>
+          <w:iCs/>
+        </w:rPr>
+        <w:t>Where stories lead.</w:t>
+      </w:r>
+    </w:p>
     <w:sectPr>
       <w:pgSz w:w="12240" w:h="15840"/>
       <w:pgMar w:top="1440" w:right="1440" w:bottom="1440" w:left="1440" w:header="708" w:footer="708" w:gutter="0"/>

</xml_diff>

<commit_message>
hero banner doc update
</commit_message>
<xml_diff>
--- a/Reference (Spia)/HERO BANNER+ABOUT.docx
+++ b/Reference (Spia)/HERO BANNER+ABOUT.docx
@@ -94,13 +94,8 @@
       <w:proofErr w:type="spellEnd"/>
     </w:p>
     <w:p>
-      <w:proofErr w:type="spellStart"/>
-      <w:r>
-        <w:t>Spia</w:t>
-      </w:r>
-      <w:proofErr w:type="spellEnd"/>
-      <w:r>
-        <w:t xml:space="preserve"> is a curated digital space built for those who believe that stories shape who we become.</w:t>
+      <w:r>
+        <w:t>Welcome to a curated digital space built for those who believe stories form who we become.</w:t>
       </w:r>
     </w:p>
     <w:p>
@@ -128,15 +123,10 @@
     </w:p>
     <w:p>
       <w:r>
-        <w:t xml:space="preserve">At its core, </w:t>
-      </w:r>
-      <w:proofErr w:type="spellStart"/>
-      <w:r>
-        <w:t>Spia</w:t>
-      </w:r>
-      <w:proofErr w:type="spellEnd"/>
-      <w:r>
-        <w:t xml:space="preserve"> is about three things:</w:t>
+        <w:t>Built on three core ideas</w:t>
+      </w:r>
+      <w:r>
+        <w:t>:</w:t>
       </w:r>
       <w:r>
         <w:br/>
@@ -182,13 +172,11 @@
       </w:r>
     </w:p>
     <w:p>
-      <w:proofErr w:type="spellStart"/>
-      <w:r>
-        <w:t>Spia's</w:t>
-      </w:r>
-      <w:proofErr w:type="spellEnd"/>
-      <w:r>
-        <w:t xml:space="preserve"> first branch, </w:t>
+      <w:r>
+        <w:t xml:space="preserve">The </w:t>
+      </w:r>
+      <w:r>
+        <w:t xml:space="preserve">first branch, </w:t>
       </w:r>
       <w:proofErr w:type="spellStart"/>
       <w:r>
@@ -224,148 +212,6 @@
       </w:r>
     </w:p>
     <w:p/>
-    <w:p/>
-    <w:p>
-      <w:proofErr w:type="gramStart"/>
-      <w:r>
-        <w:t xml:space="preserve">  </w:t>
-      </w:r>
-      <w:r>
-        <w:rPr>
-          <w:b/>
-          <w:bCs/>
-        </w:rPr>
-        <w:t>Beneath</w:t>
-      </w:r>
-      <w:proofErr w:type="gramEnd"/>
-      <w:r>
-        <w:rPr>
-          <w:b/>
-          <w:bCs/>
-        </w:rPr>
-        <w:t xml:space="preserve"> the noise</w:t>
-      </w:r>
-      <w:r>
-        <w:br/>
-      </w:r>
-      <w:r>
-        <w:rPr>
-          <w:i/>
-          <w:iCs/>
-        </w:rPr>
-        <w:t>Find what matters.</w:t>
-      </w:r>
-      <w:r>
-        <w:t xml:space="preserve"> </w:t>
-      </w:r>
-    </w:p>
-    <w:p>
-      <w:proofErr w:type="gramStart"/>
-      <w:r>
-        <w:t xml:space="preserve">  </w:t>
-      </w:r>
-      <w:r>
-        <w:rPr>
-          <w:b/>
-          <w:bCs/>
-        </w:rPr>
-        <w:t>Cut</w:t>
-      </w:r>
-      <w:proofErr w:type="gramEnd"/>
-      <w:r>
-        <w:rPr>
-          <w:b/>
-          <w:bCs/>
-        </w:rPr>
-        <w:t xml:space="preserve"> the noise</w:t>
-      </w:r>
-      <w:r>
-        <w:br/>
-      </w:r>
-      <w:r>
-        <w:rPr>
-          <w:i/>
-          <w:iCs/>
-        </w:rPr>
-        <w:t>Follow what matters.</w:t>
-      </w:r>
-      <w:r>
-        <w:t xml:space="preserve"> </w:t>
-      </w:r>
-    </w:p>
-    <w:p>
-      <w:pPr>
-        <w:rPr>
-          <w:i/>
-          <w:iCs/>
-        </w:rPr>
-      </w:pPr>
-      <w:proofErr w:type="gramStart"/>
-      <w:r>
-        <w:t xml:space="preserve">  </w:t>
-      </w:r>
-      <w:r>
-        <w:rPr>
-          <w:b/>
-          <w:bCs/>
-        </w:rPr>
-        <w:t>Beneath</w:t>
-      </w:r>
-      <w:proofErr w:type="gramEnd"/>
-      <w:r>
-        <w:rPr>
-          <w:b/>
-          <w:bCs/>
-        </w:rPr>
-        <w:t xml:space="preserve"> the noise</w:t>
-      </w:r>
-      <w:r>
-        <w:br/>
-      </w:r>
-      <w:r>
-        <w:rPr>
-          <w:i/>
-          <w:iCs/>
-        </w:rPr>
-        <w:t>Only the stories that stay.</w:t>
-      </w:r>
-    </w:p>
-    <w:p>
-      <w:pPr>
-        <w:rPr>
-          <w:i/>
-          <w:iCs/>
-        </w:rPr>
-      </w:pPr>
-    </w:p>
-    <w:p>
-      <w:r>
-        <w:rPr>
-          <w:rFonts w:ascii="Segoe UI Emoji" w:hAnsi="Segoe UI Emoji" w:cs="Segoe UI Emoji"/>
-        </w:rPr>
-        <w:t>👉</w:t>
-      </w:r>
-      <w:r>
-        <w:t xml:space="preserve"> </w:t>
-      </w:r>
-      <w:r>
-        <w:rPr>
-          <w:b/>
-          <w:bCs/>
-        </w:rPr>
-        <w:t>Beneath the noise</w:t>
-      </w:r>
-      <w:r>
-        <w:br/>
-      </w:r>
-      <w:r>
-        <w:rPr>
-          <w:i/>
-          <w:iCs/>
-        </w:rPr>
-        <w:t>Where stories lead.</w:t>
-      </w:r>
-    </w:p>
     <w:sectPr>
       <w:pgSz w:w="12240" w:h="15840"/>
       <w:pgMar w:top="1440" w:right="1440" w:bottom="1440" w:left="1440" w:header="708" w:footer="708" w:gutter="0"/>
@@ -988,6 +834,7 @@
   <w:style w:type="character" w:default="1" w:styleId="DefaultParagraphFont">
     <w:name w:val="Default Paragraph Font"/>
     <w:uiPriority w:val="1"/>
+    <w:semiHidden/>
     <w:unhideWhenUsed/>
   </w:style>
   <w:style w:type="table" w:default="1" w:styleId="TableNormal">

</xml_diff>